<commit_message>
Add Router Embedding Documentation and Implement Unit Testing Framework
- Created Router Embedding LLM Library Documentation outlining the generate_embedding function and its parameters.
- Added Together AI Embedding Provider Documentation detailing the call_together function and its expected behavior.
- Introduced Unit Testing and CI/CD documentation, including setup instructions, test structure, and GitHub Actions configuration.
- Established test stubs for embedding providers and outlined test-driven development (TDD) approach for future implementations.
</commit_message>
<xml_diff>
--- a/docs/embedding/OpenRouter_Embedding_LLM_Library_Documentation.docx
+++ b/docs/embedding/OpenRouter_Embedding_LLM_Library_Documentation.docx
@@ -13,26 +13,54 @@
     <w:p>
       <w:pPr>
         <w:pStyle w:val="Titolo2"/>
+        <w:rPr>
+          <w:lang w:val="it-IT"/>
+        </w:rPr>
       </w:pPr>
       <w:r>
+        <w:rPr>
+          <w:lang w:val="it-IT"/>
+        </w:rPr>
         <w:t>Obiettivo del Modulo</w:t>
       </w:r>
     </w:p>
     <w:p>
+      <w:pPr>
+        <w:rPr>
+          <w:lang w:val="it-IT"/>
+        </w:rPr>
+      </w:pPr>
       <w:r>
+        <w:rPr>
+          <w:lang w:val="it-IT"/>
+        </w:rPr>
         <w:t>Implementare il file ns_llm/embedding/providers/openrouter_provider.py, che espone la funzione call_openrouter(). Come gia' visto nel modulo di inference, OpenRouter e' un gateway multi-provider. Anche per gli embedding espone un'unica API che aggrega modelli da provider diversi (OpenAI, Cohere, Google, ecc.), permettendo di cambiare modello senza modificare il codice.</w:t>
       </w:r>
     </w:p>
     <w:p>
       <w:pPr>
         <w:pStyle w:val="Titolo2"/>
+        <w:rPr>
+          <w:lang w:val="it-IT"/>
+        </w:rPr>
       </w:pPr>
       <w:r>
+        <w:rPr>
+          <w:lang w:val="it-IT"/>
+        </w:rPr>
         <w:t>Firma della Funzione</w:t>
       </w:r>
     </w:p>
     <w:p>
+      <w:pPr>
+        <w:rPr>
+          <w:lang w:val="it-IT"/>
+        </w:rPr>
+      </w:pPr>
       <w:r>
+        <w:rPr>
+          <w:lang w:val="it-IT"/>
+        </w:rPr>
         <w:t>La firma seguente e' il contratto che il router di embedding si aspetta. Non modificare i nomi o l'ordine dei parametri.</w:t>
       </w:r>
     </w:p>
@@ -40,17 +68,21 @@
       <w:pPr>
         <w:shd w:val="clear" w:color="auto" w:fill="F2F2F2"/>
         <w:ind w:left="360"/>
+        <w:rPr>
+          <w:lang w:val="it-IT"/>
+        </w:rPr>
       </w:pPr>
       <w:r>
         <w:rPr>
           <w:rFonts w:ascii="Courier New" w:hAnsi="Courier New"/>
           <w:sz w:val="18"/>
+          <w:lang w:val="it-IT"/>
         </w:rPr>
         <w:t>def call_openrouter(</w:t>
         <w:br/>
         <w:t xml:space="preserve">    model: str,</w:t>
         <w:br/>
-        <w:t xml:space="preserve">    input: str,</w:t>
+        <w:t xml:space="preserve">    text: str,</w:t>
         <w:br/>
         <w:t xml:space="preserve">    input_type: str,</w:t>
         <w:br/>
@@ -61,6 +93,55 @@
         <w:t>) -&gt; dict:</w:t>
         <w:br/>
         <w:t xml:space="preserve">    pass</w:t>
+      </w:r>
+      <w:r>
+        <w:rPr>
+          <w:rFonts w:ascii="Courier New" w:hAnsi="Courier New"/>
+          <w:sz w:val="18"/>
+          <w:lang w:val="it-IT"/>
+        </w:rPr>
+      </w:r>
+      <w:r>
+        <w:rPr>
+          <w:rFonts w:ascii="Courier New" w:hAnsi="Courier New"/>
+          <w:sz w:val="18"/>
+          <w:lang w:val="it-IT"/>
+        </w:rPr>
+      </w:r>
+      <w:r>
+        <w:rPr>
+          <w:rFonts w:ascii="Courier New" w:hAnsi="Courier New"/>
+          <w:sz w:val="18"/>
+          <w:lang w:val="it-IT"/>
+        </w:rPr>
+      </w:r>
+      <w:r>
+        <w:rPr>
+          <w:rFonts w:ascii="Courier New" w:hAnsi="Courier New"/>
+          <w:sz w:val="18"/>
+          <w:lang w:val="it-IT"/>
+        </w:rPr>
+      </w:r>
+      <w:r>
+        <w:rPr>
+          <w:rFonts w:ascii="Courier New" w:hAnsi="Courier New"/>
+          <w:sz w:val="18"/>
+          <w:lang w:val="it-IT"/>
+        </w:rPr>
+      </w:r>
+      <w:r>
+        <w:rPr>
+          <w:rFonts w:ascii="Courier New" w:hAnsi="Courier New"/>
+          <w:sz w:val="18"/>
+          <w:lang w:val="it-IT"/>
+        </w:rPr>
+      </w:r>
+      <w:r>
+        <w:rPr>
+          <w:rFonts w:ascii="Courier New" w:hAnsi="Courier New"/>
+          <w:sz w:val="18"/>
+          <w:lang w:val="it-IT"/>
+        </w:rPr>
       </w:r>
     </w:p>
     <w:p>
@@ -74,8 +155,8 @@
     <w:tbl>
       <w:tblPr>
         <w:tblStyle w:val="Grigliatabella"/>
-        <w:tblW w:type="auto" w:w="0"/>
-        <w:tblLook w:firstColumn="1" w:firstRow="1" w:lastColumn="0" w:lastRow="0" w:noHBand="0" w:noVBand="1" w:val="04A0"/>
+        <w:tblW w:w="0" w:type="auto"/>
+        <w:tblLook w:val="04A0" w:firstRow="1" w:lastRow="0" w:firstColumn="1" w:lastColumn="0" w:noHBand="0" w:noVBand="1"/>
       </w:tblPr>
       <w:tblGrid>
         <w:gridCol w:w="4320"/>
@@ -84,7 +165,7 @@
       <w:tr>
         <w:tc>
           <w:tcPr>
-            <w:tcW w:type="dxa" w:w="4320"/>
+            <w:tcW w:w="4320" w:type="dxa"/>
           </w:tcPr>
           <w:p>
             <w:r>
@@ -97,7 +178,7 @@
         </w:tc>
         <w:tc>
           <w:tcPr>
-            <w:tcW w:type="dxa" w:w="4320"/>
+            <w:tcW w:w="4320" w:type="dxa"/>
           </w:tcPr>
           <w:p>
             <w:r>
@@ -112,77 +193,7 @@
       <w:tr>
         <w:tc>
           <w:tcPr>
-            <w:tcW w:type="dxa" w:w="4320"/>
-          </w:tcPr>
-          <w:p/>
-        </w:tc>
-        <w:tc>
-          <w:tcPr>
-            <w:tcW w:type="dxa" w:w="4320"/>
-          </w:tcPr>
-          <w:p/>
-        </w:tc>
-      </w:tr>
-      <w:tr>
-        <w:tc>
-          <w:tcPr>
-            <w:tcW w:type="dxa" w:w="4320"/>
-          </w:tcPr>
-          <w:p/>
-        </w:tc>
-        <w:tc>
-          <w:tcPr>
-            <w:tcW w:type="dxa" w:w="4320"/>
-          </w:tcPr>
-          <w:p/>
-        </w:tc>
-      </w:tr>
-      <w:tr>
-        <w:tc>
-          <w:tcPr>
-            <w:tcW w:type="dxa" w:w="4320"/>
-          </w:tcPr>
-          <w:p/>
-        </w:tc>
-        <w:tc>
-          <w:tcPr>
-            <w:tcW w:type="dxa" w:w="4320"/>
-          </w:tcPr>
-          <w:p/>
-        </w:tc>
-      </w:tr>
-      <w:tr>
-        <w:tc>
-          <w:tcPr>
-            <w:tcW w:type="dxa" w:w="4320"/>
-          </w:tcPr>
-          <w:p/>
-        </w:tc>
-        <w:tc>
-          <w:tcPr>
-            <w:tcW w:type="dxa" w:w="4320"/>
-          </w:tcPr>
-          <w:p/>
-        </w:tc>
-      </w:tr>
-      <w:tr>
-        <w:tc>
-          <w:tcPr>
-            <w:tcW w:type="dxa" w:w="4320"/>
-          </w:tcPr>
-          <w:p/>
-        </w:tc>
-        <w:tc>
-          <w:tcPr>
-            <w:tcW w:type="dxa" w:w="4320"/>
-          </w:tcPr>
-          <w:p/>
-        </w:tc>
-      </w:tr>
-      <w:tr>
-        <w:tc>
-          <w:tcPr>
-            <w:tcW w:type="dxa" w:w="4320"/>
+            <w:tcW w:w="4320" w:type="dxa"/>
           </w:tcPr>
           <w:p>
             <w:r>
@@ -192,11 +203,17 @@
         </w:tc>
         <w:tc>
           <w:tcPr>
-            <w:tcW w:type="dxa" w:w="4320"/>
+            <w:tcW w:w="4320" w:type="dxa"/>
           </w:tcPr>
           <w:p>
             <w:r>
-              <w:t>Nome del modello di embedding da utilizzare (es. "openai/text-embedding-3-small").</w:t>
+              <w:rPr>
+                <w:lang w:val="it-IT"/>
+              </w:rPr>
+              <w:t xml:space="preserve">Nome del modello di embedding da utilizzare (es. </w:t>
+            </w:r>
+            <w:r>
+              <w:t>"openai/text-embedding-3-small").</w:t>
             </w:r>
           </w:p>
         </w:tc>
@@ -204,20 +221,28 @@
       <w:tr>
         <w:tc>
           <w:tcPr>
-            <w:tcW w:type="dxa" w:w="4320"/>
+            <w:tcW w:w="4320" w:type="dxa"/>
           </w:tcPr>
           <w:p>
             <w:r>
-              <w:t>input</w:t>
+              <w:t>text</w:t>
             </w:r>
           </w:p>
         </w:tc>
         <w:tc>
           <w:tcPr>
-            <w:tcW w:type="dxa" w:w="4320"/>
+            <w:tcW w:w="4320" w:type="dxa"/>
           </w:tcPr>
           <w:p>
+            <w:pPr>
+              <w:rPr>
+                <w:lang w:val="it-IT"/>
+              </w:rPr>
+            </w:pPr>
             <w:r>
+              <w:rPr>
+                <w:lang w:val="it-IT"/>
+              </w:rPr>
               <w:t>Stringa di testo da convertire in vettore.</w:t>
             </w:r>
           </w:p>
@@ -226,7 +251,7 @@
       <w:tr>
         <w:tc>
           <w:tcPr>
-            <w:tcW w:type="dxa" w:w="4320"/>
+            <w:tcW w:w="4320" w:type="dxa"/>
           </w:tcPr>
           <w:p>
             <w:r>
@@ -236,10 +261,18 @@
         </w:tc>
         <w:tc>
           <w:tcPr>
-            <w:tcW w:type="dxa" w:w="4320"/>
+            <w:tcW w:w="4320" w:type="dxa"/>
           </w:tcPr>
           <w:p>
+            <w:pPr>
+              <w:rPr>
+                <w:lang w:val="it-IT"/>
+              </w:rPr>
+            </w:pPr>
             <w:r>
+              <w:rPr>
+                <w:lang w:val="it-IT"/>
+              </w:rPr>
               <w:t>Tipo semantico del testo: tipicamente "search_query" (domanda di ricerca) o "search_document" (documento da indicizzare). L'API OpenRouter accetta questo parametro; il supporto effettivo dipende pero' dal modello scelto. Attenzione: verificare nella documentazione del modello specifico se il parametro viene effettivamente utilizzato o ignorato.</w:t>
             </w:r>
           </w:p>
@@ -248,7 +281,7 @@
       <w:tr>
         <w:tc>
           <w:tcPr>
-            <w:tcW w:type="dxa" w:w="4320"/>
+            <w:tcW w:w="4320" w:type="dxa"/>
           </w:tcPr>
           <w:p>
             <w:r>
@@ -258,11 +291,17 @@
         </w:tc>
         <w:tc>
           <w:tcPr>
-            <w:tcW w:type="dxa" w:w="4320"/>
+            <w:tcW w:w="4320" w:type="dxa"/>
           </w:tcPr>
           <w:p>
             <w:r>
-              <w:t>Numero di dimensioni del vettore di output. Permette di ridurre la dimensionalita' dell'embedding. L'API OpenRouter accetta questo parametro, ma il supporto dipende dal modello scelto: ad esempio, openai/text-embedding-3-small lo supporta, altri modelli no. Verificare nella documentazione del modello scelto.</w:t>
+              <w:rPr>
+                <w:lang w:val="it-IT"/>
+              </w:rPr>
+              <w:t xml:space="preserve">Numero di dimensioni del vettore di output. Permette di ridurre la dimensionalita' dell'embedding. L'API OpenRouter accetta questo parametro, ma il supporto dipende dal modello scelto: ad esempio, openai/text-embedding-3-small lo supporta, altri modelli no. </w:t>
+            </w:r>
+            <w:r>
+              <w:t>Verificare nella documentazione del modello scelto.</w:t>
             </w:r>
           </w:p>
         </w:tc>
@@ -270,7 +309,7 @@
       <w:tr>
         <w:tc>
           <w:tcPr>
-            <w:tcW w:type="dxa" w:w="4320"/>
+            <w:tcW w:w="4320" w:type="dxa"/>
           </w:tcPr>
           <w:p>
             <w:r>
@@ -280,7 +319,7 @@
         </w:tc>
         <w:tc>
           <w:tcPr>
-            <w:tcW w:type="dxa" w:w="4320"/>
+            <w:tcW w:w="4320" w:type="dxa"/>
           </w:tcPr>
           <w:p>
             <w:r>
@@ -295,19 +334,28 @@
         <w:pStyle w:val="Titolo2"/>
       </w:pPr>
       <w:r>
+        <w:lastRenderedPageBreak/>
         <w:t>Formato di Ritorno</w:t>
       </w:r>
     </w:p>
     <w:p>
+      <w:pPr>
+        <w:rPr>
+          <w:lang w:val="it-IT"/>
+        </w:rPr>
+      </w:pPr>
       <w:r>
+        <w:rPr>
+          <w:lang w:val="it-IT"/>
+        </w:rPr>
         <w:t>La funzione deve restituire un dizionario Python con la seguente struttura, identica per tutti i provider di embedding.</w:t>
       </w:r>
     </w:p>
     <w:tbl>
       <w:tblPr>
         <w:tblStyle w:val="Grigliatabella"/>
-        <w:tblW w:type="auto" w:w="0"/>
-        <w:tblLook w:firstColumn="1" w:firstRow="1" w:lastColumn="0" w:lastRow="0" w:noHBand="0" w:noVBand="1" w:val="04A0"/>
+        <w:tblW w:w="0" w:type="auto"/>
+        <w:tblLook w:val="04A0" w:firstRow="1" w:lastRow="0" w:firstColumn="1" w:lastColumn="0" w:noHBand="0" w:noVBand="1"/>
       </w:tblPr>
       <w:tblGrid>
         <w:gridCol w:w="2880"/>
@@ -317,7 +365,7 @@
       <w:tr>
         <w:tc>
           <w:tcPr>
-            <w:tcW w:type="dxa" w:w="2880"/>
+            <w:tcW w:w="2880" w:type="dxa"/>
           </w:tcPr>
           <w:p>
             <w:r>
@@ -330,7 +378,7 @@
         </w:tc>
         <w:tc>
           <w:tcPr>
-            <w:tcW w:type="dxa" w:w="2880"/>
+            <w:tcW w:w="2880" w:type="dxa"/>
           </w:tcPr>
           <w:p>
             <w:r>
@@ -343,7 +391,7 @@
         </w:tc>
         <w:tc>
           <w:tcPr>
-            <w:tcW w:type="dxa" w:w="2880"/>
+            <w:tcW w:w="2880" w:type="dxa"/>
           </w:tcPr>
           <w:p>
             <w:r>
@@ -358,47 +406,7 @@
       <w:tr>
         <w:tc>
           <w:tcPr>
-            <w:tcW w:type="dxa" w:w="2880"/>
-          </w:tcPr>
-          <w:p/>
-        </w:tc>
-        <w:tc>
-          <w:tcPr>
-            <w:tcW w:type="dxa" w:w="2880"/>
-          </w:tcPr>
-          <w:p/>
-        </w:tc>
-        <w:tc>
-          <w:tcPr>
-            <w:tcW w:type="dxa" w:w="2880"/>
-          </w:tcPr>
-          <w:p/>
-        </w:tc>
-      </w:tr>
-      <w:tr>
-        <w:tc>
-          <w:tcPr>
-            <w:tcW w:type="dxa" w:w="2880"/>
-          </w:tcPr>
-          <w:p/>
-        </w:tc>
-        <w:tc>
-          <w:tcPr>
-            <w:tcW w:type="dxa" w:w="2880"/>
-          </w:tcPr>
-          <w:p/>
-        </w:tc>
-        <w:tc>
-          <w:tcPr>
-            <w:tcW w:type="dxa" w:w="2880"/>
-          </w:tcPr>
-          <w:p/>
-        </w:tc>
-      </w:tr>
-      <w:tr>
-        <w:tc>
-          <w:tcPr>
-            <w:tcW w:type="dxa" w:w="2880"/>
+            <w:tcW w:w="2880" w:type="dxa"/>
           </w:tcPr>
           <w:p>
             <w:r>
@@ -408,7 +416,7 @@
         </w:tc>
         <w:tc>
           <w:tcPr>
-            <w:tcW w:type="dxa" w:w="2880"/>
+            <w:tcW w:w="2880" w:type="dxa"/>
           </w:tcPr>
           <w:p>
             <w:r>
@@ -418,10 +426,18 @@
         </w:tc>
         <w:tc>
           <w:tcPr>
-            <w:tcW w:type="dxa" w:w="2880"/>
+            <w:tcW w:w="2880" w:type="dxa"/>
           </w:tcPr>
           <w:p>
+            <w:pPr>
+              <w:rPr>
+                <w:lang w:val="it-IT"/>
+              </w:rPr>
+            </w:pPr>
             <w:r>
+              <w:rPr>
+                <w:lang w:val="it-IT"/>
+              </w:rPr>
               <w:t>Vettore di numeri floating-point che rappresenta il testo nello spazio semantico.</w:t>
             </w:r>
           </w:p>
@@ -430,7 +446,7 @@
       <w:tr>
         <w:tc>
           <w:tcPr>
-            <w:tcW w:type="dxa" w:w="2880"/>
+            <w:tcW w:w="2880" w:type="dxa"/>
           </w:tcPr>
           <w:p>
             <w:r>
@@ -440,7 +456,7 @@
         </w:tc>
         <w:tc>
           <w:tcPr>
-            <w:tcW w:type="dxa" w:w="2880"/>
+            <w:tcW w:w="2880" w:type="dxa"/>
           </w:tcPr>
           <w:p>
             <w:r>
@@ -450,10 +466,18 @@
         </w:tc>
         <w:tc>
           <w:tcPr>
-            <w:tcW w:type="dxa" w:w="2880"/>
+            <w:tcW w:w="2880" w:type="dxa"/>
           </w:tcPr>
           <w:p>
+            <w:pPr>
+              <w:rPr>
+                <w:lang w:val="it-IT"/>
+              </w:rPr>
+            </w:pPr>
             <w:r>
+              <w:rPr>
+                <w:lang w:val="it-IT"/>
+              </w:rPr>
               <w:t>Numero di token nel testo inviato (disponibile nel campo usage.prompt_tokens della risposta).</w:t>
             </w:r>
           </w:p>
@@ -463,18 +487,40 @@
     <w:p>
       <w:pPr>
         <w:pStyle w:val="Titolo2"/>
+        <w:rPr>
+          <w:lang w:val="it-IT"/>
+        </w:rPr>
       </w:pPr>
       <w:r>
+        <w:rPr>
+          <w:lang w:val="it-IT"/>
+        </w:rPr>
         <w:t>Librerie Necessarie</w:t>
       </w:r>
     </w:p>
     <w:p>
+      <w:pPr>
+        <w:rPr>
+          <w:lang w:val="it-IT"/>
+        </w:rPr>
+      </w:pPr>
       <w:r>
+        <w:rPr>
+          <w:lang w:val="it-IT"/>
+        </w:rPr>
         <w:t>Verificare innanzitutto se la libreria openrouter (gia' usata per l'inference) supporta le chiamate di embedding: l'SDK e' in versione beta e il suo perimetro potrebbe essere cambiato. Consultare la documentazione aggiornata: https://openrouter.ai/docs/sdks/python</w:t>
       </w:r>
     </w:p>
     <w:p>
+      <w:pPr>
+        <w:rPr>
+          <w:lang w:val="it-IT"/>
+        </w:rPr>
+      </w:pPr>
       <w:r>
+        <w:rPr>
+          <w:lang w:val="it-IT"/>
+        </w:rPr>
         <w:t>Se l'SDK non supporta gli embedding, utilizzare la libreria requests, gia' inclusa in Python:</w:t>
       </w:r>
     </w:p>
@@ -482,125 +528,286 @@
       <w:pPr>
         <w:shd w:val="clear" w:color="auto" w:fill="F2F2F2"/>
         <w:ind w:left="360"/>
+        <w:rPr>
+          <w:lang w:val="it-IT"/>
+        </w:rPr>
       </w:pPr>
       <w:r>
         <w:rPr>
           <w:rFonts w:ascii="Courier New" w:hAnsi="Courier New"/>
           <w:sz w:val="18"/>
+          <w:lang w:val="it-IT"/>
         </w:rPr>
         <w:t># requests e' gia' inclusa in Python, non richiede pip install</w:t>
       </w:r>
     </w:p>
     <w:p>
+      <w:pPr>
+        <w:rPr>
+          <w:lang w:val="it-IT"/>
+        </w:rPr>
+      </w:pPr>
       <w:r>
+        <w:rPr>
+          <w:lang w:val="it-IT"/>
+        </w:rPr>
         <w:t>Riferimento API REST: https://openrouter.ai/docs/api/reference/embeddings</w:t>
       </w:r>
     </w:p>
     <w:p>
       <w:pPr>
         <w:pStyle w:val="Titolo2"/>
+        <w:rPr>
+          <w:lang w:val="it-IT"/>
+        </w:rPr>
       </w:pPr>
       <w:r>
+        <w:rPr>
+          <w:lang w:val="it-IT"/>
+        </w:rPr>
         <w:t>Note per l'Implementazione</w:t>
       </w:r>
     </w:p>
     <w:p>
+      <w:pPr>
+        <w:rPr>
+          <w:lang w:val="it-IT"/>
+        </w:rPr>
+      </w:pPr>
       <w:r>
+        <w:rPr>
+          <w:lang w:val="it-IT"/>
+        </w:rPr>
         <w:t>Riferimento API completo (parametri e risposta): https://openrouter.ai/docs/api-reference/embeddings/create-embeddings</w:t>
       </w:r>
     </w:p>
     <w:p>
       <w:pPr>
         <w:ind w:left="283"/>
+        <w:rPr>
+          <w:lang w:val="it-IT"/>
+        </w:rPr>
       </w:pPr>
       <w:r>
+        <w:rPr>
+          <w:lang w:val="it-IT"/>
+        </w:rPr>
         <w:t>• Modello consigliato per il testing: openai/text-embedding-3-small. Per esplorare altri modelli disponibili consultare: https://openrouter.ai/models?output_modalities=embeddings</w:t>
       </w:r>
     </w:p>
     <w:p>
       <w:pPr>
         <w:ind w:left="283"/>
+        <w:rPr>
+          <w:lang w:val="it-IT"/>
+        </w:rPr>
       </w:pPr>
       <w:r>
+        <w:rPr>
+          <w:lang w:val="it-IT"/>
+        </w:rPr>
         <w:t>• ATTENZIONE - input_type: l'API OpenRouter accetta il parametro input_type nel corpo della richiesta, ma il suo effetto dipende dal modello sottostante. Consultare la pagina del modello scelto su openrouter.ai per verificare se e' supportato e quali valori accetta. Se non supportato dal modello, il parametro potrebbe essere ignorato silenziosamente oppure causare un errore: testare il comportamento e gestire il caso nell'implementazione (es. includere input_type nel corpo solo se non vuoto).</w:t>
       </w:r>
     </w:p>
     <w:p>
       <w:pPr>
         <w:ind w:left="283"/>
+        <w:rPr>
+          <w:lang w:val="it-IT"/>
+        </w:rPr>
       </w:pPr>
       <w:r>
+        <w:rPr>
+          <w:lang w:val="it-IT"/>
+        </w:rPr>
         <w:t>• ATTENZIONE - dimensions: l'API OpenRouter accetta il parametro dimensions nel corpo della richiesta. Anche in questo caso il supporto dipende dal modello: openai/text-embedding-3-small lo supporta, altri modelli potrebbero ignorarlo o restituire un errore. Verificare nella documentazione del modello scelto e includere dimensions nel corpo della richiesta solo se dimensions &gt; 0.</w:t>
       </w:r>
     </w:p>
     <w:p>
       <w:pPr>
         <w:ind w:left="283"/>
+        <w:rPr>
+          <w:lang w:val="it-IT"/>
+        </w:rPr>
       </w:pPr>
       <w:r>
-        <w:t>• Se si usa requests: l'endpoint e' POST https://openrouter.ai/api/v1/embeddings, con header Authorization: Bearer &lt;api_key&gt; e Content-Type: application/json. Il corpo e' un dizionario JSON con i campi model, input, e opzionalmente input_type e dimensions.</w:t>
+        <w:lastRenderedPageBreak/>
+        <w:t xml:space="preserve">• Se si usa requests: l'endpoint e' POST https://openrouter.ai/api/v1/embeddings, con header Authorization: Bearer &lt;api_key&gt; e Content-Type: application/json. </w:t>
+      </w:r>
+      <w:r>
+        <w:rPr>
+          <w:lang w:val="it-IT"/>
+        </w:rPr>
+        <w:t>Il corpo e' un dizionario JSON con i campi model, input, e opzionalmente input_type e dimensions.</w:t>
       </w:r>
     </w:p>
     <w:p>
       <w:pPr>
         <w:ind w:left="283"/>
+        <w:rPr>
+          <w:lang w:val="it-IT"/>
+        </w:rPr>
       </w:pPr>
       <w:r>
+        <w:rPr>
+          <w:lang w:val="it-IT"/>
+        </w:rPr>
         <w:t>• La risposta include il campo usage con prompt_tokens e total_tokens. La struttura e': {"data": [{"embedding": [...], "index": 0}], "usage": {"prompt_tokens": N, ...}}. Se si usa requests, convertire la risposta con response.json().</w:t>
       </w:r>
     </w:p>
     <w:p>
       <w:pPr>
         <w:ind w:left="283"/>
+        <w:rPr>
+          <w:lang w:val="it-IT"/>
+        </w:rPr>
       </w:pPr>
       <w:r>
+        <w:rPr>
+          <w:lang w:val="it-IT"/>
+        </w:rPr>
         <w:t>• Nota: l'SDK openrouter e' attualmente in versione beta. Verificare sempre la documentazione aggiornata per nomi di metodi, attributi e parametri supportati.</w:t>
       </w:r>
     </w:p>
     <w:p>
       <w:pPr>
         <w:pStyle w:val="Titolo2"/>
+        <w:rPr>
+          <w:lang w:val="it-IT"/>
+        </w:rPr>
       </w:pPr>
       <w:r>
+        <w:rPr>
+          <w:lang w:val="it-IT"/>
+        </w:rPr>
         <w:t>Posizione nel Progetto</w:t>
       </w:r>
     </w:p>
     <w:p>
+      <w:pPr>
+        <w:rPr>
+          <w:lang w:val="it-IT"/>
+        </w:rPr>
+      </w:pPr>
       <w:r>
-        <w:t>Il file da creare e' ns_llm/embedding/providers/openrouter_provider.py. Deve trovarsi nella sottocartella providers/ del sottomodulo embedding. Il router di embedding (ns_llm/embedding/client.py, implementato in un task successivo) importera' la funzione direttamente da questo file.</w:t>
+        <w:rPr>
+          <w:lang w:val="it-IT"/>
+        </w:rPr>
+        <w:t>Il file ns_llm/embedding/providers/openrouter_provider.py è già stato creato come stub nell'esercitazione di Unit Testing e CI/CD (lanciando NotImplementedError). In questa esercitazione completerai l'implementazione sostituendo il corpo della funzione con la logica reale.</w:t>
       </w:r>
     </w:p>
     <w:p>
       <w:pPr>
         <w:shd w:val="clear" w:color="auto" w:fill="F2F2F2"/>
         <w:ind w:left="360"/>
+        <w:rPr>
+          <w:lang w:val="it-IT"/>
+        </w:rPr>
       </w:pPr>
       <w:r>
         <w:rPr>
           <w:rFonts w:ascii="Courier New" w:hAnsi="Courier New"/>
           <w:sz w:val="18"/>
+          <w:lang w:val="it-IT"/>
         </w:rPr>
         <w:t>ns_llm/</w:t>
+      </w:r>
+      <w:r>
+        <w:rPr>
+          <w:rFonts w:ascii="Courier New" w:hAnsi="Courier New"/>
+          <w:sz w:val="18"/>
+          <w:lang w:val="it-IT"/>
+        </w:rPr>
         <w:br/>
         <w:t>|</w:t>
+      </w:r>
+      <w:r>
+        <w:rPr>
+          <w:rFonts w:ascii="Courier New" w:hAnsi="Courier New"/>
+          <w:sz w:val="18"/>
+          <w:lang w:val="it-IT"/>
+        </w:rPr>
         <w:br/>
         <w:t>├── inference/</w:t>
+      </w:r>
+      <w:r>
+        <w:rPr>
+          <w:rFonts w:ascii="Courier New" w:hAnsi="Courier New"/>
+          <w:sz w:val="18"/>
+          <w:lang w:val="it-IT"/>
+        </w:rPr>
         <w:br/>
         <w:t>│   └── ...</w:t>
+      </w:r>
+      <w:r>
+        <w:rPr>
+          <w:rFonts w:ascii="Courier New" w:hAnsi="Courier New"/>
+          <w:sz w:val="18"/>
+          <w:lang w:val="it-IT"/>
+        </w:rPr>
         <w:br/>
         <w:t>|</w:t>
+      </w:r>
+      <w:r>
+        <w:rPr>
+          <w:rFonts w:ascii="Courier New" w:hAnsi="Courier New"/>
+          <w:sz w:val="18"/>
+          <w:lang w:val="it-IT"/>
+        </w:rPr>
         <w:br/>
         <w:t>└── embedding/</w:t>
+      </w:r>
+      <w:r>
+        <w:rPr>
+          <w:rFonts w:ascii="Courier New" w:hAnsi="Courier New"/>
+          <w:sz w:val="18"/>
+          <w:lang w:val="it-IT"/>
+        </w:rPr>
         <w:br/>
         <w:t xml:space="preserve">    ├── __init__.py</w:t>
+      </w:r>
+      <w:r>
+        <w:rPr>
+          <w:rFonts w:ascii="Courier New" w:hAnsi="Courier New"/>
+          <w:sz w:val="18"/>
+          <w:lang w:val="it-IT"/>
+        </w:rPr>
         <w:br/>
         <w:t xml:space="preserve">    ├── client.py                &lt;- router embedding (futuro)</w:t>
+      </w:r>
+      <w:r>
+        <w:rPr>
+          <w:rFonts w:ascii="Courier New" w:hAnsi="Courier New"/>
+          <w:sz w:val="18"/>
+          <w:lang w:val="it-IT"/>
+        </w:rPr>
         <w:br/>
         <w:t xml:space="preserve">    └── providers/</w:t>
+      </w:r>
+      <w:r>
+        <w:rPr>
+          <w:rFonts w:ascii="Courier New" w:hAnsi="Courier New"/>
+          <w:sz w:val="18"/>
+          <w:lang w:val="it-IT"/>
+        </w:rPr>
         <w:br/>
         <w:t xml:space="preserve">        ├── __init__.py</w:t>
+      </w:r>
+      <w:r>
+        <w:rPr>
+          <w:rFonts w:ascii="Courier New" w:hAnsi="Courier New"/>
+          <w:sz w:val="18"/>
+          <w:lang w:val="it-IT"/>
+        </w:rPr>
         <w:br/>
         <w:t xml:space="preserve">        ├── together_provider.py</w:t>
+      </w:r>
+      <w:r>
+        <w:rPr>
+          <w:rFonts w:ascii="Courier New" w:hAnsi="Courier New"/>
+          <w:sz w:val="18"/>
+          <w:lang w:val="it-IT"/>
+        </w:rPr>
         <w:br/>
         <w:t xml:space="preserve">        └── openrouter_provider.py   &lt;-- file da implementare</w:t>
       </w:r>
@@ -608,21 +815,104 @@
     <w:p>
       <w:pPr>
         <w:pStyle w:val="Titolo2"/>
+        <w:rPr>
+          <w:lang w:val="it-IT"/>
+        </w:rPr>
       </w:pPr>
       <w:r>
+        <w:rPr>
+          <w:lang w:val="it-IT"/>
+        </w:rPr>
+        <w:t>Test-Driven Development</w:t>
+      </w:r>
+    </w:p>
+    <w:p>
+      <w:pPr>
+        <w:rPr>
+          <w:lang w:val="it-IT"/>
+        </w:rPr>
+      </w:pPr>
+      <w:r>
+        <w:rPr>
+          <w:lang w:val="it-IT"/>
+        </w:rPr>
+        <w:t>Nell'esercitazione di Unit Testing e CI/CD hai già scritto il file tests/test_openrouter_embedding.py con i test che definiscono il comportamento atteso di questa funzione. I test al momento falliscono con NotImplementedError perché il codice reale non è ancora stato implementato.</w:t>
+      </w:r>
+    </w:p>
+    <w:p>
+      <w:pPr>
+        <w:rPr>
+          <w:lang w:val="it-IT"/>
+        </w:rPr>
+      </w:pPr>
+      <w:r>
+        <w:rPr>
+          <w:lang w:val="it-IT"/>
+        </w:rPr>
+        <w:t>In questa esercitazione scriverai il codice di call_openrouter() facendo passare i test uno alla volta (ciclo TDD Red-Green-Refactor). Quando tutti i test in test_openrouter_embedding.py passeranno, l'implementazione sarà completa. Ricorda: se l'SDK openrouter non supporta gli embedding, dovrai usare la libreria requests per chiamare l'API REST direttamente. I test che hai scritto nell'esercitazione di TDD ti guideranno nel capire se la tua implementazione è corretta, indipendentemente dall'approccio scelto (SDK o REST).</w:t>
+      </w:r>
+    </w:p>
+    <w:p>
+      <w:pPr>
+        <w:rPr>
+          <w:lang w:val="it-IT"/>
+        </w:rPr>
+      </w:pPr>
+      <w:r>
+        <w:rPr>
+          <w:lang w:val="it-IT"/>
+        </w:rPr>
+        <w:t>Per eseguire solo i test di questo provider:</w:t>
+      </w:r>
+    </w:p>
+    <w:p>
+      <w:r>
+        <w:t>pytest tests/test_openrouter_embedding.py -v</w:t>
+      </w:r>
+    </w:p>
+    <w:p>
+      <w:pPr>
+        <w:rPr>
+          <w:lang w:val="it-IT"/>
+        </w:rPr>
+      </w:pPr>
+      <w:r>
+        <w:rPr>
+          <w:lang w:val="it-IT"/>
+        </w:rPr>
+        <w:t>Riferimento: consulta il documento docs/test/Unit_Testing_LLM_Library_Documentation.docx (Task 4) per la lista completa dei test da far passare.</w:t>
+      </w:r>
+    </w:p>
+    <w:p>
+      <w:pPr>
+        <w:pStyle w:val="Titolo2"/>
+        <w:rPr>
+          <w:lang w:val="it-IT"/>
+        </w:rPr>
+      </w:pPr>
+      <w:r>
+        <w:rPr>
+          <w:lang w:val="it-IT"/>
+        </w:rPr>
         <w:t>Risorse Python per Principianti</w:t>
       </w:r>
     </w:p>
     <w:p>
       <w:r>
-        <w:t>Non e' necessario leggere tutto in anticipo: consulta queste risorse man mano che hai dubbi. La documentazione ufficiale dell'API rimane la fonte piu' importante.</w:t>
+        <w:rPr>
+          <w:lang w:val="it-IT"/>
+        </w:rPr>
+        <w:t xml:space="preserve">Non e' necessario leggere tutto in anticipo: consulta queste risorse man mano che hai dubbi. </w:t>
+      </w:r>
+      <w:r>
+        <w:t>La documentazione ufficiale dell'API rimane la fonte piu' importante.</w:t>
       </w:r>
     </w:p>
     <w:tbl>
       <w:tblPr>
         <w:tblStyle w:val="Grigliatabella"/>
-        <w:tblW w:type="auto" w:w="0"/>
-        <w:tblLook w:firstColumn="1" w:firstRow="1" w:lastColumn="0" w:lastRow="0" w:noHBand="0" w:noVBand="1" w:val="04A0"/>
+        <w:tblW w:w="0" w:type="auto"/>
+        <w:tblLook w:val="04A0" w:firstRow="1" w:lastRow="0" w:firstColumn="1" w:lastColumn="0" w:noHBand="0" w:noVBand="1"/>
       </w:tblPr>
       <w:tblGrid>
         <w:gridCol w:w="2880"/>
@@ -632,7 +922,7 @@
       <w:tr>
         <w:tc>
           <w:tcPr>
-            <w:tcW w:type="dxa" w:w="2880"/>
+            <w:tcW w:w="2880" w:type="dxa"/>
           </w:tcPr>
           <w:p>
             <w:r>
@@ -645,7 +935,7 @@
         </w:tc>
         <w:tc>
           <w:tcPr>
-            <w:tcW w:type="dxa" w:w="2880"/>
+            <w:tcW w:w="2880" w:type="dxa"/>
           </w:tcPr>
           <w:p>
             <w:r>
@@ -658,7 +948,7 @@
         </w:tc>
         <w:tc>
           <w:tcPr>
-            <w:tcW w:type="dxa" w:w="2880"/>
+            <w:tcW w:w="2880" w:type="dxa"/>
           </w:tcPr>
           <w:p>
             <w:r>
@@ -673,107 +963,7 @@
       <w:tr>
         <w:tc>
           <w:tcPr>
-            <w:tcW w:type="dxa" w:w="2880"/>
-          </w:tcPr>
-          <w:p/>
-        </w:tc>
-        <w:tc>
-          <w:tcPr>
-            <w:tcW w:type="dxa" w:w="2880"/>
-          </w:tcPr>
-          <w:p/>
-        </w:tc>
-        <w:tc>
-          <w:tcPr>
-            <w:tcW w:type="dxa" w:w="2880"/>
-          </w:tcPr>
-          <w:p/>
-        </w:tc>
-      </w:tr>
-      <w:tr>
-        <w:tc>
-          <w:tcPr>
-            <w:tcW w:type="dxa" w:w="2880"/>
-          </w:tcPr>
-          <w:p/>
-        </w:tc>
-        <w:tc>
-          <w:tcPr>
-            <w:tcW w:type="dxa" w:w="2880"/>
-          </w:tcPr>
-          <w:p/>
-        </w:tc>
-        <w:tc>
-          <w:tcPr>
-            <w:tcW w:type="dxa" w:w="2880"/>
-          </w:tcPr>
-          <w:p/>
-        </w:tc>
-      </w:tr>
-      <w:tr>
-        <w:tc>
-          <w:tcPr>
-            <w:tcW w:type="dxa" w:w="2880"/>
-          </w:tcPr>
-          <w:p/>
-        </w:tc>
-        <w:tc>
-          <w:tcPr>
-            <w:tcW w:type="dxa" w:w="2880"/>
-          </w:tcPr>
-          <w:p/>
-        </w:tc>
-        <w:tc>
-          <w:tcPr>
-            <w:tcW w:type="dxa" w:w="2880"/>
-          </w:tcPr>
-          <w:p/>
-        </w:tc>
-      </w:tr>
-      <w:tr>
-        <w:tc>
-          <w:tcPr>
-            <w:tcW w:type="dxa" w:w="2880"/>
-          </w:tcPr>
-          <w:p/>
-        </w:tc>
-        <w:tc>
-          <w:tcPr>
-            <w:tcW w:type="dxa" w:w="2880"/>
-          </w:tcPr>
-          <w:p/>
-        </w:tc>
-        <w:tc>
-          <w:tcPr>
-            <w:tcW w:type="dxa" w:w="2880"/>
-          </w:tcPr>
-          <w:p/>
-        </w:tc>
-      </w:tr>
-      <w:tr>
-        <w:tc>
-          <w:tcPr>
-            <w:tcW w:type="dxa" w:w="2880"/>
-          </w:tcPr>
-          <w:p/>
-        </w:tc>
-        <w:tc>
-          <w:tcPr>
-            <w:tcW w:type="dxa" w:w="2880"/>
-          </w:tcPr>
-          <w:p/>
-        </w:tc>
-        <w:tc>
-          <w:tcPr>
-            <w:tcW w:type="dxa" w:w="2880"/>
-          </w:tcPr>
-          <w:p/>
-        </w:tc>
-      </w:tr>
-      <w:tr>
-        <w:tc>
-          <w:tcPr>
-            <w:tcW w:type="dxa" w:w="2880"/>
+            <w:tcW w:w="2880" w:type="dxa"/>
           </w:tcPr>
           <w:p>
             <w:r>
@@ -783,7 +973,7 @@
         </w:tc>
         <w:tc>
           <w:tcPr>
-            <w:tcW w:type="dxa" w:w="2880"/>
+            <w:tcW w:w="2880" w:type="dxa"/>
           </w:tcPr>
           <w:p>
             <w:r>
@@ -793,10 +983,18 @@
         </w:tc>
         <w:tc>
           <w:tcPr>
-            <w:tcW w:type="dxa" w:w="2880"/>
+            <w:tcW w:w="2880" w:type="dxa"/>
           </w:tcPr>
           <w:p>
+            <w:pPr>
+              <w:rPr>
+                <w:lang w:val="it-IT"/>
+              </w:rPr>
+            </w:pPr>
             <w:r>
+              <w:rPr>
+                <w:lang w:val="it-IT"/>
+              </w:rPr>
               <w:t>Esegue una richiesta HTTP POST.</w:t>
             </w:r>
           </w:p>
@@ -805,7 +1003,7 @@
       <w:tr>
         <w:tc>
           <w:tcPr>
-            <w:tcW w:type="dxa" w:w="2880"/>
+            <w:tcW w:w="2880" w:type="dxa"/>
           </w:tcPr>
           <w:p>
             <w:r>
@@ -815,7 +1013,7 @@
         </w:tc>
         <w:tc>
           <w:tcPr>
-            <w:tcW w:type="dxa" w:w="2880"/>
+            <w:tcW w:w="2880" w:type="dxa"/>
           </w:tcPr>
           <w:p>
             <w:r>
@@ -825,10 +1023,18 @@
         </w:tc>
         <w:tc>
           <w:tcPr>
-            <w:tcW w:type="dxa" w:w="2880"/>
+            <w:tcW w:w="2880" w:type="dxa"/>
           </w:tcPr>
           <w:p>
+            <w:pPr>
+              <w:rPr>
+                <w:lang w:val="it-IT"/>
+              </w:rPr>
+            </w:pPr>
             <w:r>
+              <w:rPr>
+                <w:lang w:val="it-IT"/>
+              </w:rPr>
               <w:t>Converte il corpo JSON della risposta in un dizionario Python.</w:t>
             </w:r>
           </w:p>
@@ -837,7 +1043,7 @@
       <w:tr>
         <w:tc>
           <w:tcPr>
-            <w:tcW w:type="dxa" w:w="2880"/>
+            <w:tcW w:w="2880" w:type="dxa"/>
           </w:tcPr>
           <w:p>
             <w:r>
@@ -847,7 +1053,7 @@
         </w:tc>
         <w:tc>
           <w:tcPr>
-            <w:tcW w:type="dxa" w:w="2880"/>
+            <w:tcW w:w="2880" w:type="dxa"/>
           </w:tcPr>
           <w:p>
             <w:r>
@@ -857,10 +1063,18 @@
         </w:tc>
         <w:tc>
           <w:tcPr>
-            <w:tcW w:type="dxa" w:w="2880"/>
+            <w:tcW w:w="2880" w:type="dxa"/>
           </w:tcPr>
           <w:p>
+            <w:pPr>
+              <w:rPr>
+                <w:lang w:val="it-IT"/>
+              </w:rPr>
+            </w:pPr>
             <w:r>
+              <w:rPr>
+                <w:lang w:val="it-IT"/>
+              </w:rPr>
               <w:t>Accesso a campi annidati in un dizionario.</w:t>
             </w:r>
           </w:p>
@@ -869,7 +1083,7 @@
       <w:tr>
         <w:tc>
           <w:tcPr>
-            <w:tcW w:type="dxa" w:w="2880"/>
+            <w:tcW w:w="2880" w:type="dxa"/>
           </w:tcPr>
           <w:p>
             <w:r>
@@ -879,7 +1093,7 @@
         </w:tc>
         <w:tc>
           <w:tcPr>
-            <w:tcW w:type="dxa" w:w="2880"/>
+            <w:tcW w:w="2880" w:type="dxa"/>
           </w:tcPr>
           <w:p>
             <w:r>
@@ -889,10 +1103,18 @@
         </w:tc>
         <w:tc>
           <w:tcPr>
-            <w:tcW w:type="dxa" w:w="2880"/>
+            <w:tcW w:w="2880" w:type="dxa"/>
           </w:tcPr>
           <w:p>
+            <w:pPr>
+              <w:rPr>
+                <w:lang w:val="it-IT"/>
+              </w:rPr>
+            </w:pPr>
             <w:r>
+              <w:rPr>
+                <w:lang w:val="it-IT"/>
+              </w:rPr>
               <w:t>Tipo dell'embedding: lista di numeri decimali.</w:t>
             </w:r>
           </w:p>
@@ -901,7 +1123,7 @@
       <w:tr>
         <w:tc>
           <w:tcPr>
-            <w:tcW w:type="dxa" w:w="2880"/>
+            <w:tcW w:w="2880" w:type="dxa"/>
           </w:tcPr>
           <w:p>
             <w:r>
@@ -911,7 +1133,7 @@
         </w:tc>
         <w:tc>
           <w:tcPr>
-            <w:tcW w:type="dxa" w:w="2880"/>
+            <w:tcW w:w="2880" w:type="dxa"/>
           </w:tcPr>
           <w:p>
             <w:r>
@@ -921,10 +1143,18 @@
         </w:tc>
         <w:tc>
           <w:tcPr>
-            <w:tcW w:type="dxa" w:w="2880"/>
+            <w:tcW w:w="2880" w:type="dxa"/>
           </w:tcPr>
           <w:p>
+            <w:pPr>
+              <w:rPr>
+                <w:lang w:val="it-IT"/>
+              </w:rPr>
+            </w:pPr>
             <w:r>
+              <w:rPr>
+                <w:lang w:val="it-IT"/>
+              </w:rPr>
               <w:t>Includere un campo nel dizionario JSON solo se la condizione e' vera.</w:t>
             </w:r>
           </w:p>
@@ -934,18 +1164,40 @@
     <w:p>
       <w:pPr>
         <w:pStyle w:val="Titolo2"/>
+        <w:rPr>
+          <w:lang w:val="it-IT"/>
+        </w:rPr>
       </w:pPr>
       <w:r>
+        <w:rPr>
+          <w:lang w:val="it-IT"/>
+        </w:rPr>
         <w:t>Considerazioni Finali</w:t>
       </w:r>
     </w:p>
     <w:p>
+      <w:pPr>
+        <w:rPr>
+          <w:lang w:val="it-IT"/>
+        </w:rPr>
+      </w:pPr>
       <w:r>
+        <w:rPr>
+          <w:lang w:val="it-IT"/>
+        </w:rPr>
         <w:t>Questa implementazione mostra come la stessa firma contrattuale possa nascondere implementazioni molto diverse: tramite SDK dedicato (come per l'inference) o tramite chiamata HTTP diretta. Dal punto di vista del chiamante, call_openrouter() si comporta identicamente agli altri provider.</w:t>
       </w:r>
     </w:p>
     <w:p>
+      <w:pPr>
+        <w:rPr>
+          <w:lang w:val="it-IT"/>
+        </w:rPr>
+      </w:pPr>
       <w:r>
+        <w:rPr>
+          <w:lang w:val="it-IT"/>
+        </w:rPr>
         <w:t>La gestione di parametri opzionali con supporto variabile tra modelli (input_type, dimensions) e' un caso comune nelle integrazioni con API di terze parti. La strategia corretta e' includere il parametro nella richiesta solo quando ha un valore significativo e documentare chiaramente il comportamento atteso, senza assumere che tutti i modelli si comportino allo stesso modo.</w:t>
       </w:r>
     </w:p>

</xml_diff>